<commit_message>
Update Zotero SQLite files
</commit_message>
<xml_diff>
--- a/submission/BRCA-IV-Surgery_Breast_Cancer_Basic_and_Clinical_Research.docx
+++ b/submission/BRCA-IV-Surgery_Breast_Cancer_Basic_and_Clinical_Research.docx
@@ -313,20 +313,20 @@
         <w:t xml:space="preserve"> </w:t>
       </w:r>
       <w:r>
+        <w:t>Chao</w:t>
+      </w:r>
+      <w:r>
+        <w:rPr>
+          <w:spacing w:val="-33"/>
+        </w:rPr>
+        <w:t xml:space="preserve"> </w:t>
+      </w:r>
+      <w:r>
         <w:t>Zheng</w:t>
       </w:r>
       <w:r>
         <w:rPr>
           <w:spacing w:val="-11"/>
-        </w:rPr>
-        <w:t xml:space="preserve"> </w:t>
-      </w:r>
-      <w:r>
-        <w:t>Chao</w:t>
-      </w:r>
-      <w:r>
-        <w:rPr>
-          <w:spacing w:val="-33"/>
         </w:rPr>
         <w:t xml:space="preserve"> </w:t>
       </w:r>
@@ -968,27 +968,10 @@
         <w:t xml:space="preserve">Yuan Zhang </w:t>
       </w:r>
       <w:r>
-        <w:fldChar w:fldCharType="begin"/>
-      </w:r>
-      <w:r>
-        <w:instrText xml:space="preserve"> HYPERLINK "mailto:legend7262010@hotmail.com" \h </w:instrText>
-      </w:r>
-      <w:r>
-        <w:fldChar w:fldCharType="separate"/>
-      </w:r>
-      <w:r>
-        <w:rPr>
-          <w:rFonts w:ascii="Arial"/>
-          <w:w w:val="95"/>
-        </w:rPr>
-        <w:t>legend7262010@hotmail.com</w:t>
-      </w:r>
-      <w:r>
-        <w:rPr>
-          <w:rFonts w:ascii="Arial"/>
-          <w:w w:val="95"/>
-        </w:rPr>
-        <w:fldChar w:fldCharType="end"/>
+        <w:rPr>
+          <w:rFonts w:hint="eastAsia" w:ascii="Arial"/>
+        </w:rPr>
+        <w:t>2015141241065@stu.scu.edu.cn</w:t>
       </w:r>
     </w:p>
     <w:p>
@@ -1367,7 +1350,7 @@
       <w:pPr>
         <w:pStyle w:val="5"/>
         <w:spacing w:before="260" w:line="259" w:lineRule="auto"/>
-        <w:ind w:left="174" w:right="142"/>
+        <w:ind w:left="174" w:right="142" w:firstLine="240" w:firstLineChars="100"/>
       </w:pPr>
       <w:r>
         <w:t>Breast</w:t>
@@ -4071,237 +4054,9 @@
       </w:pPr>
       <w:r>
         <w:rPr>
-          <w:spacing w:val="-3"/>
-        </w:rPr>
-        <w:t xml:space="preserve">With </w:t>
-      </w:r>
-      <w:r>
-        <w:t>the advancement of breast cancer research, oncologists are facing greater challenges in managing patient</w:t>
-      </w:r>
-      <w:r>
-        <w:rPr>
-          <w:spacing w:val="-9"/>
-        </w:rPr>
-        <w:t xml:space="preserve"> </w:t>
-      </w:r>
-      <w:r>
-        <w:t>information.</w:t>
-      </w:r>
-      <w:r>
-        <w:rPr>
-          <w:spacing w:val="-8"/>
-        </w:rPr>
-        <w:t xml:space="preserve"> </w:t>
-      </w:r>
-      <w:r>
-        <w:t>Despite</w:t>
-      </w:r>
-      <w:r>
-        <w:rPr>
-          <w:spacing w:val="-9"/>
-        </w:rPr>
-        <w:t xml:space="preserve"> </w:t>
-      </w:r>
-      <w:r>
-        <w:t>being</w:t>
-      </w:r>
-      <w:r>
-        <w:rPr>
-          <w:spacing w:val="-8"/>
-        </w:rPr>
-        <w:t xml:space="preserve"> </w:t>
-      </w:r>
-      <w:r>
-        <w:t>developed</w:t>
-      </w:r>
-      <w:r>
-        <w:rPr>
-          <w:spacing w:val="-9"/>
-        </w:rPr>
-        <w:t xml:space="preserve"> </w:t>
-      </w:r>
-      <w:r>
-        <w:t>to</w:t>
-      </w:r>
-      <w:r>
-        <w:rPr>
-          <w:spacing w:val="-8"/>
-        </w:rPr>
-        <w:t xml:space="preserve"> </w:t>
-      </w:r>
-      <w:r>
-        <w:t>aid</w:t>
-      </w:r>
-      <w:r>
-        <w:rPr>
-          <w:spacing w:val="-8"/>
-        </w:rPr>
-        <w:t xml:space="preserve"> </w:t>
-      </w:r>
-      <w:r>
-        <w:t>clinical</w:t>
-      </w:r>
-      <w:r>
-        <w:rPr>
-          <w:spacing w:val="-9"/>
-        </w:rPr>
-        <w:t xml:space="preserve"> </w:t>
-      </w:r>
-      <w:r>
-        <w:t>decision-making,</w:t>
-      </w:r>
-      <w:r>
-        <w:rPr>
-          <w:spacing w:val="-8"/>
-        </w:rPr>
-        <w:t xml:space="preserve"> </w:t>
-      </w:r>
-      <w:r>
-        <w:t>computational</w:t>
-      </w:r>
-      <w:r>
-        <w:rPr>
-          <w:spacing w:val="-9"/>
-        </w:rPr>
-        <w:t xml:space="preserve"> </w:t>
-      </w:r>
-      <w:r>
-        <w:t xml:space="preserve">technologies </w:t>
-      </w:r>
-      <w:r>
-        <w:rPr>
-          <w:spacing w:val="-3"/>
-        </w:rPr>
-        <w:t xml:space="preserve">have </w:t>
-      </w:r>
-      <w:r>
-        <w:t xml:space="preserve">not yet been widely adopted in clinical practice. </w:t>
-      </w:r>
-      <w:r>
-        <w:rPr>
-          <w:spacing w:val="-3"/>
-        </w:rPr>
-        <w:t xml:space="preserve">Consequently,We </w:t>
-      </w:r>
-      <w:r>
-        <w:t>utilized treatment data and the patient’s clinicopathological characteristics, incorporating deep learning techniques to develop a model for stage IV breast cancer. This model includes an explainable module that offers both recommendations and description of the predicted log hazard rate. By establishing a communication channel between the model and clinicians, we enhanced transparency and reliability through the application of explainable  AI technology. This allows doctors to better understand the recommendations made by the deep learning algorithm,</w:t>
-      </w:r>
-      <w:r>
-        <w:rPr>
-          <w:spacing w:val="-25"/>
-        </w:rPr>
-        <w:t xml:space="preserve"> </w:t>
-      </w:r>
-      <w:r>
-        <w:t>facilitating</w:t>
-      </w:r>
-      <w:r>
-        <w:rPr>
-          <w:spacing w:val="-26"/>
-        </w:rPr>
-        <w:t xml:space="preserve"> </w:t>
-      </w:r>
-      <w:r>
-        <w:t>a</w:t>
-      </w:r>
-      <w:r>
-        <w:rPr>
-          <w:spacing w:val="-26"/>
-        </w:rPr>
-        <w:t xml:space="preserve"> </w:t>
-      </w:r>
-      <w:r>
-        <w:t>clearer</w:t>
-      </w:r>
-      <w:r>
-        <w:rPr>
-          <w:spacing w:val="-26"/>
-        </w:rPr>
-        <w:t xml:space="preserve"> </w:t>
-      </w:r>
-      <w:r>
-        <w:t>interpretation</w:t>
-      </w:r>
-      <w:r>
-        <w:rPr>
-          <w:spacing w:val="-26"/>
-        </w:rPr>
-        <w:t xml:space="preserve"> </w:t>
-      </w:r>
-      <w:r>
-        <w:t>of</w:t>
-      </w:r>
-      <w:r>
-        <w:rPr>
-          <w:spacing w:val="-26"/>
-        </w:rPr>
-        <w:t xml:space="preserve"> </w:t>
-      </w:r>
-      <w:r>
-        <w:t>the</w:t>
-      </w:r>
-      <w:r>
-        <w:rPr>
-          <w:spacing w:val="-26"/>
-        </w:rPr>
-        <w:t xml:space="preserve"> </w:t>
-      </w:r>
-      <w:r>
-        <w:t>model’s</w:t>
-      </w:r>
-      <w:r>
-        <w:rPr>
-          <w:spacing w:val="-25"/>
-        </w:rPr>
-        <w:t xml:space="preserve"> </w:t>
-      </w:r>
-      <w:r>
-        <w:t>suggestions</w:t>
-      </w:r>
-      <w:r>
-        <w:rPr>
-          <w:spacing w:val="-26"/>
-        </w:rPr>
-        <w:t xml:space="preserve"> </w:t>
-      </w:r>
-      <w:r>
-        <w:t>for</w:t>
-      </w:r>
-      <w:r>
-        <w:rPr>
-          <w:spacing w:val="-26"/>
-        </w:rPr>
-        <w:t xml:space="preserve"> </w:t>
-      </w:r>
-      <w:r>
-        <w:t>specific</w:t>
-      </w:r>
-      <w:r>
-        <w:rPr>
-          <w:spacing w:val="-26"/>
-        </w:rPr>
-        <w:t xml:space="preserve"> </w:t>
-      </w:r>
-      <w:r>
-        <w:t>local</w:t>
-      </w:r>
-      <w:r>
-        <w:rPr>
-          <w:spacing w:val="-26"/>
-        </w:rPr>
-        <w:t xml:space="preserve"> </w:t>
-      </w:r>
-      <w:r>
-        <w:t>treatment</w:t>
-      </w:r>
-      <w:r>
-        <w:rPr>
-          <w:spacing w:val="-26"/>
-        </w:rPr>
-        <w:t xml:space="preserve"> </w:t>
-      </w:r>
-      <w:r>
-        <w:t>options.</w:t>
+          <w:rFonts w:hint="eastAsia"/>
+        </w:rPr>
+        <w:t>As breast cancer research progresses, oncologists are increasingly challenged with managing complex patient data. Although computational tools have been designed to support clinical decision-making, their integration into everyday practice remains limited. To address this, we developed a deep learning–based model tailored for stage IV breast cancer, leveraging both treatment records and clinicopathological information. The model features an explainable component that not only provides treatment recommendations but also interprets the predicted log hazard rate. By creating an interactive interface between clinicians and the model, we improve transparency and trust through explainable AI. This approach helps physicians better comprehend the algorithm’s suggestions, enabling more informed decisions regarding personalized local treatment strategies.</w:t>
       </w:r>
     </w:p>
     <w:p>
@@ -4331,9 +4086,9 @@
       </w:pPr>
       <w:bookmarkStart w:id="2" w:name="Eligibility Criteria and Patient Informa"/>
       <w:bookmarkEnd w:id="2"/>
-      <w:bookmarkStart w:id="3" w:name="Method"/>
+      <w:bookmarkStart w:id="3" w:name="Eligibility Criteria and Patient Informa"/>
       <w:bookmarkEnd w:id="3"/>
-      <w:bookmarkStart w:id="4" w:name="Eligibility Criteria and Patient Informa"/>
+      <w:bookmarkStart w:id="4" w:name="Method"/>
       <w:bookmarkEnd w:id="4"/>
       <w:r>
         <w:rPr>
@@ -4686,11 +4441,24 @@
     <w:p>
       <w:pPr>
         <w:pStyle w:val="5"/>
+        <w:numPr>
+          <w:ilvl w:val="0"/>
+          <w:numId w:val="2"/>
+        </w:numPr>
         <w:spacing w:before="3" w:line="259" w:lineRule="auto"/>
         <w:ind w:left="120" w:right="150"/>
+        <w:rPr>
+          <w:rFonts w:hint="eastAsia" w:eastAsia="宋体"/>
+          <w:lang w:val="en-US" w:eastAsia="zh-CN"/>
+        </w:rPr>
       </w:pPr>
       <w:r>
-        <w:t xml:space="preserve">(1) histological diagnosis of M1 breast cancer in female patients diagnosed between January 2013 and December 2018; and (2) the presence of one malignant lesion. On the contrary, we eliminated instances cases that fulfilled the following criteria: (1) individuals having ambiguous or incomplete Metastasis location. Demographic data (age and marital status at diagnosis), characteristics specific to breast cancer (TNM stage, histology type, tumor laterality, breast Subtype, grade, ER status, PR status, metastasis location), and information about treatment (primary site </w:t>
+        <w:t>histological diagnosis of M1 breast cancer in female patients diagnosed between January 2013 and December 2018; and (2) the presence of one malignant lesion. On the contrary, we eliminated instances cases that fulfilled the following criteria: (1) individuals having ambiguous or incomplete Metastasis location. Demographic data (age and marital status at diagnosis), characteristics specific to breast cancer (TNM stage, histology type, tumor latera</w:t>
+      </w:r>
+      <w:bookmarkStart w:id="63" w:name="_GoBack"/>
+      <w:bookmarkEnd w:id="63"/>
+      <w:r>
+        <w:t xml:space="preserve">lity, breast Subtype, grade, ER status, PR status, metastasis location), and information about treatment (primary site </w:t>
       </w:r>
       <w:r>
         <w:rPr>
@@ -6167,11 +5935,11 @@
         <w:ind w:left="577" w:right="0" w:hanging="404"/>
         <w:jc w:val="left"/>
       </w:pPr>
-      <w:bookmarkStart w:id="10" w:name="Results"/>
+      <w:bookmarkStart w:id="10" w:name="Patient Baseline Characteristics"/>
       <w:bookmarkEnd w:id="10"/>
       <w:bookmarkStart w:id="11" w:name="Patient Baseline Characteristics"/>
       <w:bookmarkEnd w:id="11"/>
-      <w:bookmarkStart w:id="12" w:name="Patient Baseline Characteristics"/>
+      <w:bookmarkStart w:id="12" w:name="Results"/>
       <w:bookmarkEnd w:id="12"/>
       <w:r>
         <w:rPr>
@@ -22888,7 +22656,7 @@
         <w:pStyle w:val="11"/>
         <w:numPr>
           <w:ilvl w:val="0"/>
-          <w:numId w:val="2"/>
+          <w:numId w:val="3"/>
         </w:numPr>
         <w:tabs>
           <w:tab w:val="left" w:pos="474"/>
@@ -23162,7 +22930,7 @@
         <w:pStyle w:val="11"/>
         <w:numPr>
           <w:ilvl w:val="0"/>
-          <w:numId w:val="2"/>
+          <w:numId w:val="3"/>
         </w:numPr>
         <w:tabs>
           <w:tab w:val="left" w:pos="474"/>
@@ -23416,7 +23184,7 @@
         <w:pStyle w:val="11"/>
         <w:numPr>
           <w:ilvl w:val="0"/>
-          <w:numId w:val="2"/>
+          <w:numId w:val="3"/>
         </w:numPr>
         <w:tabs>
           <w:tab w:val="left" w:pos="474"/>
@@ -23717,7 +23485,7 @@
         <w:pStyle w:val="11"/>
         <w:numPr>
           <w:ilvl w:val="0"/>
-          <w:numId w:val="2"/>
+          <w:numId w:val="3"/>
         </w:numPr>
         <w:tabs>
           <w:tab w:val="left" w:pos="474"/>
@@ -24189,7 +23957,7 @@
         <w:pStyle w:val="11"/>
         <w:numPr>
           <w:ilvl w:val="0"/>
-          <w:numId w:val="2"/>
+          <w:numId w:val="3"/>
         </w:numPr>
         <w:tabs>
           <w:tab w:val="left" w:pos="474"/>
@@ -24463,7 +24231,7 @@
         <w:pStyle w:val="11"/>
         <w:numPr>
           <w:ilvl w:val="0"/>
-          <w:numId w:val="2"/>
+          <w:numId w:val="3"/>
         </w:numPr>
         <w:tabs>
           <w:tab w:val="left" w:pos="474"/>
@@ -24725,7 +24493,7 @@
         <w:pStyle w:val="11"/>
         <w:numPr>
           <w:ilvl w:val="0"/>
-          <w:numId w:val="2"/>
+          <w:numId w:val="3"/>
         </w:numPr>
         <w:tabs>
           <w:tab w:val="left" w:pos="474"/>
@@ -25253,7 +25021,7 @@
         <w:pStyle w:val="11"/>
         <w:numPr>
           <w:ilvl w:val="0"/>
-          <w:numId w:val="2"/>
+          <w:numId w:val="3"/>
         </w:numPr>
         <w:tabs>
           <w:tab w:val="left" w:pos="474"/>
@@ -25366,7 +25134,7 @@
         <w:pStyle w:val="11"/>
         <w:numPr>
           <w:ilvl w:val="0"/>
-          <w:numId w:val="2"/>
+          <w:numId w:val="3"/>
         </w:numPr>
         <w:tabs>
           <w:tab w:val="left" w:pos="474"/>
@@ -25497,7 +25265,7 @@
         <w:pStyle w:val="11"/>
         <w:numPr>
           <w:ilvl w:val="0"/>
-          <w:numId w:val="2"/>
+          <w:numId w:val="3"/>
         </w:numPr>
         <w:tabs>
           <w:tab w:val="left" w:pos="474"/>
@@ -25588,7 +25356,7 @@
         <w:pStyle w:val="11"/>
         <w:numPr>
           <w:ilvl w:val="0"/>
-          <w:numId w:val="2"/>
+          <w:numId w:val="3"/>
         </w:numPr>
         <w:tabs>
           <w:tab w:val="left" w:pos="474"/>
@@ -25680,7 +25448,7 @@
         <w:pStyle w:val="11"/>
         <w:numPr>
           <w:ilvl w:val="0"/>
-          <w:numId w:val="2"/>
+          <w:numId w:val="3"/>
         </w:numPr>
         <w:tabs>
           <w:tab w:val="left" w:pos="428"/>
@@ -25749,7 +25517,7 @@
         <w:pStyle w:val="11"/>
         <w:numPr>
           <w:ilvl w:val="0"/>
-          <w:numId w:val="2"/>
+          <w:numId w:val="3"/>
         </w:numPr>
         <w:tabs>
           <w:tab w:val="left" w:pos="428"/>
@@ -25827,7 +25595,7 @@
         <w:pStyle w:val="11"/>
         <w:numPr>
           <w:ilvl w:val="0"/>
-          <w:numId w:val="2"/>
+          <w:numId w:val="3"/>
         </w:numPr>
         <w:tabs>
           <w:tab w:val="left" w:pos="428"/>
@@ -25967,7 +25735,7 @@
         <w:pStyle w:val="11"/>
         <w:numPr>
           <w:ilvl w:val="0"/>
-          <w:numId w:val="2"/>
+          <w:numId w:val="3"/>
         </w:numPr>
         <w:tabs>
           <w:tab w:val="left" w:pos="428"/>
@@ -26059,7 +25827,7 @@
         <w:pStyle w:val="11"/>
         <w:numPr>
           <w:ilvl w:val="0"/>
-          <w:numId w:val="2"/>
+          <w:numId w:val="3"/>
         </w:numPr>
         <w:tabs>
           <w:tab w:val="left" w:pos="428"/>
@@ -26178,7 +25946,7 @@
         <w:pStyle w:val="11"/>
         <w:numPr>
           <w:ilvl w:val="0"/>
-          <w:numId w:val="2"/>
+          <w:numId w:val="3"/>
         </w:numPr>
         <w:tabs>
           <w:tab w:val="left" w:pos="428"/>
@@ -26442,7 +26210,7 @@
         <w:pStyle w:val="11"/>
         <w:numPr>
           <w:ilvl w:val="0"/>
-          <w:numId w:val="2"/>
+          <w:numId w:val="3"/>
         </w:numPr>
         <w:tabs>
           <w:tab w:val="left" w:pos="428"/>
@@ -26737,7 +26505,7 @@
         <w:pStyle w:val="11"/>
         <w:numPr>
           <w:ilvl w:val="0"/>
-          <w:numId w:val="2"/>
+          <w:numId w:val="3"/>
         </w:numPr>
         <w:tabs>
           <w:tab w:val="left" w:pos="428"/>
@@ -26843,7 +26611,7 @@
         <w:pStyle w:val="11"/>
         <w:numPr>
           <w:ilvl w:val="0"/>
-          <w:numId w:val="2"/>
+          <w:numId w:val="3"/>
         </w:numPr>
         <w:tabs>
           <w:tab w:val="left" w:pos="428"/>
@@ -27276,7 +27044,7 @@
         <w:pStyle w:val="11"/>
         <w:numPr>
           <w:ilvl w:val="0"/>
-          <w:numId w:val="2"/>
+          <w:numId w:val="3"/>
         </w:numPr>
         <w:tabs>
           <w:tab w:val="left" w:pos="428"/>
@@ -27395,7 +27163,7 @@
         <w:pStyle w:val="11"/>
         <w:numPr>
           <w:ilvl w:val="0"/>
-          <w:numId w:val="2"/>
+          <w:numId w:val="3"/>
         </w:numPr>
         <w:tabs>
           <w:tab w:val="left" w:pos="428"/>
@@ -27620,7 +27388,7 @@
         <w:pStyle w:val="11"/>
         <w:numPr>
           <w:ilvl w:val="0"/>
-          <w:numId w:val="2"/>
+          <w:numId w:val="3"/>
         </w:numPr>
         <w:tabs>
           <w:tab w:val="left" w:pos="428"/>
@@ -27700,7 +27468,7 @@
         <w:pStyle w:val="11"/>
         <w:numPr>
           <w:ilvl w:val="0"/>
-          <w:numId w:val="2"/>
+          <w:numId w:val="3"/>
         </w:numPr>
         <w:tabs>
           <w:tab w:val="left" w:pos="428"/>
@@ -28124,7 +27892,7 @@
         <w:pStyle w:val="11"/>
         <w:numPr>
           <w:ilvl w:val="0"/>
-          <w:numId w:val="2"/>
+          <w:numId w:val="3"/>
         </w:numPr>
         <w:tabs>
           <w:tab w:val="left" w:pos="428"/>
@@ -28411,7 +28179,7 @@
         <w:pStyle w:val="11"/>
         <w:numPr>
           <w:ilvl w:val="0"/>
-          <w:numId w:val="2"/>
+          <w:numId w:val="3"/>
         </w:numPr>
         <w:tabs>
           <w:tab w:val="left" w:pos="428"/>
@@ -28810,7 +28578,7 @@
         <w:pStyle w:val="11"/>
         <w:numPr>
           <w:ilvl w:val="0"/>
-          <w:numId w:val="2"/>
+          <w:numId w:val="3"/>
         </w:numPr>
         <w:tabs>
           <w:tab w:val="left" w:pos="428"/>
@@ -29028,7 +28796,7 @@
         <w:pStyle w:val="11"/>
         <w:numPr>
           <w:ilvl w:val="0"/>
-          <w:numId w:val="2"/>
+          <w:numId w:val="3"/>
         </w:numPr>
         <w:tabs>
           <w:tab w:val="left" w:pos="428"/>
@@ -29271,7 +29039,7 @@
         <w:pStyle w:val="11"/>
         <w:numPr>
           <w:ilvl w:val="0"/>
-          <w:numId w:val="2"/>
+          <w:numId w:val="3"/>
         </w:numPr>
         <w:tabs>
           <w:tab w:val="left" w:pos="428"/>
@@ -29365,7 +29133,7 @@
         <w:pStyle w:val="11"/>
         <w:numPr>
           <w:ilvl w:val="0"/>
-          <w:numId w:val="2"/>
+          <w:numId w:val="3"/>
         </w:numPr>
         <w:tabs>
           <w:tab w:val="left" w:pos="474"/>
@@ -29572,7 +29340,7 @@
         <w:pStyle w:val="11"/>
         <w:numPr>
           <w:ilvl w:val="0"/>
-          <w:numId w:val="2"/>
+          <w:numId w:val="3"/>
         </w:numPr>
         <w:tabs>
           <w:tab w:val="left" w:pos="474"/>
@@ -29707,8 +29475,6 @@
         </v:line>
       </w:pict>
     </w:r>
-    <w:bookmarkStart w:id="63" w:name="_GoBack"/>
-    <w:bookmarkEnd w:id="63"/>
     <w:r>
       <w:pict>
         <v:shape id="_x0000_s2055" o:spid="_x0000_s2055" o:spt="202" type="#_x0000_t202" style="position:absolute;left:0pt;margin-left:46.7pt;margin-top:777.25pt;height:15.8pt;width:49.15pt;mso-position-horizontal-relative:page;mso-position-vertical-relative:page;z-index:-251652096;mso-width-relative:page;mso-height-relative:page;" filled="f" stroked="f" coordsize="21600,21600">
@@ -29992,6 +29758,18 @@
     </w:lvl>
   </w:abstractNum>
   <w:abstractNum w:abstractNumId="1">
+    <w:nsid w:val="F08BC4C6"/>
+    <w:multiLevelType w:val="singleLevel"/>
+    <w:tmpl w:val="F08BC4C6"/>
+    <w:lvl w:ilvl="0" w:tentative="0">
+      <w:start w:val="1"/>
+      <w:numFmt w:val="decimal"/>
+      <w:suff w:val="space"/>
+      <w:lvlText w:val="(%1)"/>
+      <w:lvlJc w:val="left"/>
+    </w:lvl>
+  </w:abstractNum>
+  <w:abstractNum w:abstractNumId="2">
     <w:nsid w:val="0053208E"/>
     <w:multiLevelType w:val="multilevel"/>
     <w:tmpl w:val="0053208E"/>
@@ -30118,9 +29896,12 @@
     </w:lvl>
   </w:abstractNum>
   <w:num w:numId="1">
+    <w:abstractNumId w:val="2"/>
+  </w:num>
+  <w:num w:numId="2">
     <w:abstractNumId w:val="1"/>
   </w:num>
-  <w:num w:numId="2">
+  <w:num w:numId="3">
     <w:abstractNumId w:val="0"/>
   </w:num>
 </w:numbering>
@@ -30202,7 +29983,7 @@
     <w:lsdException w:qFormat="1" w:unhideWhenUsed="0" w:uiPriority="1" w:semiHidden="0" w:name="Title"/>
     <w:lsdException w:unhideWhenUsed="0" w:uiPriority="0" w:semiHidden="0" w:name="Closing"/>
     <w:lsdException w:unhideWhenUsed="0" w:uiPriority="0" w:semiHidden="0" w:name="Signature"/>
-    <w:lsdException w:uiPriority="1" w:name="Default Paragraph Font"/>
+    <w:lsdException w:qFormat="1" w:uiPriority="1" w:name="Default Paragraph Font"/>
     <w:lsdException w:qFormat="1" w:unhideWhenUsed="0" w:uiPriority="1" w:semiHidden="0" w:name="Body Text"/>
     <w:lsdException w:unhideWhenUsed="0" w:uiPriority="0" w:semiHidden="0" w:name="Body Text Indent"/>
     <w:lsdException w:unhideWhenUsed="0" w:uiPriority="0" w:semiHidden="0" w:name="List Continue"/>
@@ -30466,6 +30247,7 @@
     <w:name w:val="Default Paragraph Font"/>
     <w:semiHidden/>
     <w:unhideWhenUsed/>
+    <w:qFormat/>
     <w:uiPriority w:val="1"/>
   </w:style>
   <w:style w:type="table" w:default="1" w:styleId="8">

</xml_diff>

<commit_message>
Fix the corresponding Author List
</commit_message>
<xml_diff>
--- a/submission/BRCA-IV-Surgery_Breast_Cancer_Basic_and_Clinical_Research.docx
+++ b/submission/BRCA-IV-Surgery_Breast_Cancer_Basic_and_Clinical_Research.docx
@@ -482,13 +482,10 @@
         <w:t xml:space="preserve"> </w:t>
       </w:r>
       <w:r>
-        <w:t>and</w:t>
-      </w:r>
-      <w:r>
-        <w:rPr>
-          <w:spacing w:val="-1"/>
-        </w:rPr>
-        <w:t xml:space="preserve"> </w:t>
+        <w:rPr>
+          <w:spacing w:val="2"/>
+        </w:rPr>
+        <w:t>,</w:t>
       </w:r>
       <w:r>
         <w:t>Xulong</w:t>
@@ -535,6 +532,49 @@
         </w:rPr>
         <w:t>7</w:t>
       </w:r>
+      <w:r>
+        <w:t>and</w:t>
+      </w:r>
+      <w:r>
+        <w:rPr>
+          <w:spacing w:val="-1"/>
+        </w:rPr>
+        <w:t xml:space="preserve"> </w:t>
+      </w:r>
+      <w:r>
+        <w:rPr>
+          <w:rFonts w:ascii="Arial"/>
+        </w:rPr>
+        <w:t>Yuan Zhang</w:t>
+      </w:r>
+      <w:r>
+        <w:rPr>
+          <w:spacing w:val="-27"/>
+        </w:rPr>
+        <w:t xml:space="preserve"> </w:t>
+      </w:r>
+      <w:r>
+        <w:rPr>
+          <w:rFonts w:ascii="Microsoft Yi Baiti"/>
+          <w:b w:val="0"/>
+          <w:spacing w:val="5"/>
+          <w:position w:val="9"/>
+          <w:sz w:val="18"/>
+        </w:rPr>
+        <w:t>6</w:t>
+      </w:r>
+    </w:p>
+    <w:p>
+      <w:pPr>
+        <w:pStyle w:val="3"/>
+        <w:spacing w:before="50" w:line="295" w:lineRule="auto"/>
+        <w:ind w:left="128" w:right="1503" w:firstLine="0"/>
+        <w:rPr>
+          <w:rFonts w:ascii="Microsoft Yi Baiti"/>
+          <w:b w:val="0"/>
+          <w:sz w:val="18"/>
+        </w:rPr>
+      </w:pPr>
     </w:p>
     <w:p>
       <w:pPr>
@@ -937,59 +977,12 @@
     <w:p>
       <w:pPr>
         <w:pStyle w:val="4"/>
-        <w:spacing w:before="85" w:line="263" w:lineRule="exact"/>
-        <w:ind w:left="128"/>
         <w:jc w:val="left"/>
         <w:rPr>
           <w:rFonts w:ascii="Arial"/>
+          <w:sz w:val="30"/>
         </w:rPr>
       </w:pPr>
-      <w:r>
-        <w:rPr>
-          <w:rFonts w:ascii="Arial"/>
-        </w:rPr>
-        <w:t>Correspondence*:</w:t>
-      </w:r>
-    </w:p>
-    <w:p>
-      <w:pPr>
-        <w:pStyle w:val="4"/>
-        <w:spacing w:before="9" w:line="216" w:lineRule="auto"/>
-        <w:ind w:left="128" w:right="5929" w:hanging="8"/>
-        <w:jc w:val="left"/>
-        <w:rPr>
-          <w:rFonts w:ascii="Arial"/>
-        </w:rPr>
-      </w:pPr>
-      <w:r>
-        <w:rPr>
-          <w:rFonts w:ascii="Arial"/>
-        </w:rPr>
-        <w:t xml:space="preserve">Yuan Zhang </w:t>
-      </w:r>
-      <w:r>
-        <w:fldChar w:fldCharType="begin"/>
-      </w:r>
-      <w:r>
-        <w:instrText xml:space="preserve"> HYPERLINK "mailto:legend7262010@hotmail.com" \h </w:instrText>
-      </w:r>
-      <w:r>
-        <w:fldChar w:fldCharType="separate"/>
-      </w:r>
-      <w:r>
-        <w:rPr>
-          <w:rFonts w:ascii="Arial"/>
-          <w:w w:val="95"/>
-        </w:rPr>
-        <w:t>legend7262010@hotmail.com</w:t>
-      </w:r>
-      <w:r>
-        <w:rPr>
-          <w:rFonts w:ascii="Arial"/>
-          <w:w w:val="95"/>
-        </w:rPr>
-        <w:fldChar w:fldCharType="end"/>
-      </w:r>
     </w:p>
     <w:p>
       <w:pPr>
@@ -5373,9 +5366,9 @@
       </w:pPr>
       <w:bookmarkStart w:id="2" w:name="Eligibility Criteria and Patient Informa"/>
       <w:bookmarkEnd w:id="2"/>
-      <w:bookmarkStart w:id="3" w:name="Eligibility Criteria and Patient Informa"/>
+      <w:bookmarkStart w:id="3" w:name="Method"/>
       <w:bookmarkEnd w:id="3"/>
-      <w:bookmarkStart w:id="4" w:name="Method"/>
+      <w:bookmarkStart w:id="4" w:name="Eligibility Criteria and Patient Informa"/>
       <w:bookmarkEnd w:id="4"/>
       <w:r>
         <w:rPr>
@@ -6807,8 +6800,6 @@
         <w:ind w:left="745" w:right="0" w:hanging="572"/>
         <w:jc w:val="left"/>
       </w:pPr>
-      <w:bookmarkStart w:id="60" w:name="_GoBack"/>
-      <w:bookmarkEnd w:id="60"/>
       <w:bookmarkStart w:id="8" w:name="Computation Software"/>
       <w:bookmarkEnd w:id="8"/>
       <w:bookmarkStart w:id="9" w:name="Computation Software"/>
@@ -7480,14 +7471,6 @@
                   </w:tr>
                   <w:tr>
                     <w:tblPrEx>
-                      <w:tblBorders>
-                        <w:top w:val="none" w:color="auto" w:sz="0" w:space="0"/>
-                        <w:left w:val="none" w:color="auto" w:sz="0" w:space="0"/>
-                        <w:bottom w:val="none" w:color="auto" w:sz="0" w:space="0"/>
-                        <w:right w:val="none" w:color="auto" w:sz="0" w:space="0"/>
-                        <w:insideH w:val="none" w:color="auto" w:sz="0" w:space="0"/>
-                        <w:insideV w:val="none" w:color="auto" w:sz="0" w:space="0"/>
-                      </w:tblBorders>
                       <w:tblCellMar>
                         <w:top w:w="0" w:type="dxa"/>
                         <w:left w:w="0" w:type="dxa"/>
@@ -8057,14 +8040,6 @@
                   </w:tr>
                   <w:tr>
                     <w:tblPrEx>
-                      <w:tblBorders>
-                        <w:top w:val="none" w:color="auto" w:sz="0" w:space="0"/>
-                        <w:left w:val="none" w:color="auto" w:sz="0" w:space="0"/>
-                        <w:bottom w:val="none" w:color="auto" w:sz="0" w:space="0"/>
-                        <w:right w:val="none" w:color="auto" w:sz="0" w:space="0"/>
-                        <w:insideH w:val="none" w:color="auto" w:sz="0" w:space="0"/>
-                        <w:insideV w:val="none" w:color="auto" w:sz="0" w:space="0"/>
-                      </w:tblBorders>
                       <w:tblCellMar>
                         <w:top w:w="0" w:type="dxa"/>
                         <w:left w:w="0" w:type="dxa"/>
@@ -27359,6 +27334,8 @@
         </w:rPr>
         <w:t>0467.</w:t>
       </w:r>
+      <w:bookmarkStart w:id="60" w:name="_GoBack"/>
+      <w:bookmarkEnd w:id="60"/>
     </w:p>
     <w:sectPr>
       <w:pgSz w:w="11910" w:h="16840"/>
@@ -28028,7 +28005,7 @@
     <w:lsdException w:qFormat="1" w:unhideWhenUsed="0" w:uiPriority="1" w:semiHidden="0" w:name="Title"/>
     <w:lsdException w:unhideWhenUsed="0" w:uiPriority="0" w:semiHidden="0" w:name="Closing"/>
     <w:lsdException w:unhideWhenUsed="0" w:uiPriority="0" w:semiHidden="0" w:name="Signature"/>
-    <w:lsdException w:uiPriority="1" w:name="Default Paragraph Font"/>
+    <w:lsdException w:qFormat="1" w:uiPriority="1" w:name="Default Paragraph Font"/>
     <w:lsdException w:qFormat="1" w:unhideWhenUsed="0" w:uiPriority="1" w:semiHidden="0" w:name="Body Text"/>
     <w:lsdException w:unhideWhenUsed="0" w:uiPriority="0" w:semiHidden="0" w:name="Body Text Indent"/>
     <w:lsdException w:unhideWhenUsed="0" w:uiPriority="0" w:semiHidden="0" w:name="List Continue"/>
@@ -28048,7 +28025,7 @@
     <w:lsdException w:unhideWhenUsed="0" w:uiPriority="0" w:semiHidden="0" w:name="Body Text Indent 2"/>
     <w:lsdException w:unhideWhenUsed="0" w:uiPriority="0" w:semiHidden="0" w:name="Body Text Indent 3"/>
     <w:lsdException w:unhideWhenUsed="0" w:uiPriority="0" w:semiHidden="0" w:name="Block Text"/>
-    <w:lsdException w:unhideWhenUsed="0" w:uiPriority="0" w:semiHidden="0" w:name="Hyperlink"/>
+    <w:lsdException w:qFormat="1" w:unhideWhenUsed="0" w:uiPriority="0" w:semiHidden="0" w:name="Hyperlink"/>
     <w:lsdException w:unhideWhenUsed="0" w:uiPriority="0" w:semiHidden="0" w:name="FollowedHyperlink"/>
     <w:lsdException w:qFormat="1" w:unhideWhenUsed="0" w:uiPriority="0" w:semiHidden="0" w:name="Strong"/>
     <w:lsdException w:qFormat="1" w:unhideWhenUsed="0" w:uiPriority="0" w:semiHidden="0" w:name="Emphasis"/>
@@ -28066,7 +28043,7 @@
     <w:lsdException w:unhideWhenUsed="0" w:uiPriority="0" w:semiHidden="0" w:name="HTML Sample"/>
     <w:lsdException w:unhideWhenUsed="0" w:uiPriority="0" w:semiHidden="0" w:name="HTML Typewriter"/>
     <w:lsdException w:unhideWhenUsed="0" w:uiPriority="0" w:semiHidden="0" w:name="HTML Variable"/>
-    <w:lsdException w:unhideWhenUsed="0" w:uiPriority="0" w:name="Normal Table"/>
+    <w:lsdException w:qFormat="1" w:unhideWhenUsed="0" w:uiPriority="0" w:name="Normal Table"/>
     <w:lsdException w:unhideWhenUsed="0" w:uiPriority="0" w:semiHidden="0" w:name="annotation subject"/>
     <w:lsdException w:unhideWhenUsed="0" w:uiPriority="0" w:semiHidden="0" w:name="Table Simple 1"/>
     <w:lsdException w:unhideWhenUsed="0" w:uiPriority="0" w:semiHidden="0" w:name="Table Simple 2"/>
@@ -28270,11 +28247,13 @@
     <w:name w:val="Default Paragraph Font"/>
     <w:semiHidden/>
     <w:unhideWhenUsed/>
+    <w:qFormat/>
     <w:uiPriority w:val="1"/>
   </w:style>
   <w:style w:type="table" w:default="1" w:styleId="8">
     <w:name w:val="Normal Table"/>
     <w:semiHidden/>
+    <w:qFormat/>
     <w:uiPriority w:val="0"/>
     <w:tblPr>
       <w:tblCellMar>
@@ -28358,6 +28337,7 @@
   <w:style w:type="character" w:styleId="10">
     <w:name w:val="Hyperlink"/>
     <w:basedOn w:val="9"/>
+    <w:qFormat/>
     <w:uiPriority w:val="0"/>
     <w:rPr>
       <w:color w:val="0000FF"/>

</xml_diff>